<commit_message>
Optimize dot placeholders: replace empty placeholders with empty string if dotted lines exist in the template, else add fallbacks
</commit_message>
<xml_diff>
--- a/template 1.docx
+++ b/template 1.docx
@@ -557,26 +557,9 @@
           <w:rFonts w:ascii="TH Sarabun New" w:hAnsi="TH Sarabun New" w:cs="TH Sarabun New"/>
           <w:sz w:val="30"/>
           <w:szCs w:val="30"/>
-        </w:rPr>
-        <w:t>{{</w:t>
-      </w:r>
-      <w:proofErr w:type="spellStart"/>
-      <w:r>
-        <w:rPr>
-          <w:rFonts w:ascii="TH Sarabun New" w:hAnsi="TH Sarabun New" w:cs="TH Sarabun New"/>
-          <w:sz w:val="30"/>
-          <w:szCs w:val="30"/>
-        </w:rPr>
-        <w:t>p_nationality</w:t>
-      </w:r>
-      <w:proofErr w:type="spellEnd"/>
-      <w:r>
-        <w:rPr>
-          <w:rFonts w:ascii="TH Sarabun New" w:hAnsi="TH Sarabun New" w:cs="TH Sarabun New"/>
-          <w:sz w:val="30"/>
-          <w:szCs w:val="30"/>
-        </w:rPr>
-        <w:t>}}</w:t>
+          <w:u w:val="dotted"/>
+        </w:rPr>
+        <w:t>{{p_nationality}}</w:t>
       </w:r>
     </w:p>
     <w:p>
@@ -1069,6 +1052,16 @@
       </w:r>
       <w:r>
         <w:rPr>
+          <w:rFonts w:ascii="TH Sarabun New" w:hAnsi="TH Sarabun New" w:cs="TH Sarabun New" w:hint="cs"/>
+          <w:sz w:val="30"/>
+          <w:szCs w:val="30"/>
+          <w:u w:val="dotted"/>
+          <w:cs/>
+        </w:rPr>
+        <w:t xml:space="preserve">   </w:t>
+      </w:r>
+      <w:r>
+        <w:rPr>
           <w:rFonts w:ascii="TH Sarabun New" w:hAnsi="TH Sarabun New" w:cs="TH Sarabun New"/>
           <w:sz w:val="30"/>
           <w:szCs w:val="30"/>
@@ -1112,7 +1105,26 @@
           <w:szCs w:val="30"/>
           <w:u w:val="dotted"/>
         </w:rPr>
-        <w:t>m}}</w:t>
+        <w:t>m}</w:t>
+      </w:r>
+      <w:r>
+        <w:rPr>
+          <w:rFonts w:ascii="TH Sarabun New" w:hAnsi="TH Sarabun New" w:cs="TH Sarabun New"/>
+          <w:sz w:val="30"/>
+          <w:szCs w:val="30"/>
+          <w:u w:val="dotted"/>
+        </w:rPr>
+        <w:t>}</w:t>
+      </w:r>
+      <w:r>
+        <w:rPr>
+          <w:rFonts w:ascii="TH Sarabun New" w:hAnsi="TH Sarabun New" w:cs="TH Sarabun New" w:hint="cs"/>
+          <w:sz w:val="30"/>
+          <w:szCs w:val="30"/>
+          <w:u w:val="dotted"/>
+          <w:cs/>
+        </w:rPr>
+        <w:t xml:space="preserve">  </w:t>
       </w:r>
       <w:r>
         <w:rPr>
@@ -1141,7 +1153,16 @@
           <w:szCs w:val="30"/>
           <w:u w:val="dotted"/>
         </w:rPr>
-        <w:t>{{p_shop</w:t>
+        <w:t xml:space="preserve">  {</w:t>
+      </w:r>
+      <w:r>
+        <w:rPr>
+          <w:rFonts w:ascii="TH Sarabun New" w:hAnsi="TH Sarabun New" w:cs="TH Sarabun New"/>
+          <w:sz w:val="30"/>
+          <w:szCs w:val="30"/>
+          <w:u w:val="dotted"/>
+        </w:rPr>
+        <w:t>{p_shop</w:t>
       </w:r>
       <w:r>
         <w:rPr>
@@ -1159,7 +1180,16 @@
           <w:szCs w:val="30"/>
           <w:u w:val="dotted"/>
         </w:rPr>
-        <w:t>t}}</w:t>
+        <w:t>t}</w:t>
+      </w:r>
+      <w:r>
+        <w:rPr>
+          <w:rFonts w:ascii="TH Sarabun New" w:hAnsi="TH Sarabun New" w:cs="TH Sarabun New"/>
+          <w:sz w:val="30"/>
+          <w:szCs w:val="30"/>
+          <w:u w:val="dotted"/>
+        </w:rPr>
+        <w:t xml:space="preserve">}    </w:t>
       </w:r>
       <w:r>
         <w:rPr>
@@ -1178,7 +1208,16 @@
           <w:szCs w:val="30"/>
           <w:u w:val="dotted"/>
         </w:rPr>
-        <w:t>{{p_shop</w:t>
+        <w:t xml:space="preserve"> {</w:t>
+      </w:r>
+      <w:r>
+        <w:rPr>
+          <w:rFonts w:ascii="TH Sarabun New" w:hAnsi="TH Sarabun New" w:cs="TH Sarabun New"/>
+          <w:sz w:val="30"/>
+          <w:szCs w:val="30"/>
+          <w:u w:val="dotted"/>
+        </w:rPr>
+        <w:t>{p_shop</w:t>
       </w:r>
       <w:r>
         <w:rPr>
@@ -1196,7 +1235,16 @@
           <w:szCs w:val="30"/>
           <w:u w:val="dotted"/>
         </w:rPr>
-        <w:t>a}}</w:t>
+        <w:t>a}</w:t>
+      </w:r>
+      <w:r>
+        <w:rPr>
+          <w:rFonts w:ascii="TH Sarabun New" w:hAnsi="TH Sarabun New" w:cs="TH Sarabun New"/>
+          <w:sz w:val="30"/>
+          <w:szCs w:val="30"/>
+          <w:u w:val="dotted"/>
+        </w:rPr>
+        <w:t xml:space="preserve">}  </w:t>
       </w:r>
       <w:r>
         <w:rPr>
@@ -1217,6 +1265,15 @@
           <w:cs/>
         </w:rPr>
         <w:tab/>
+      </w:r>
+      <w:r>
+        <w:rPr>
+          <w:rFonts w:ascii="TH Sarabun New" w:hAnsi="TH Sarabun New" w:cs="TH Sarabun New"/>
+          <w:sz w:val="30"/>
+          <w:szCs w:val="30"/>
+          <w:u w:val="dotted"/>
+        </w:rPr>
+        <w:t xml:space="preserve"> </w:t>
       </w:r>
       <w:r>
         <w:rPr>
@@ -1701,7 +1758,6 @@
           <w:rFonts w:ascii="TH Sarabun New" w:hAnsi="TH Sarabun New" w:cs="TH Sarabun New"/>
           <w:sz w:val="30"/>
           <w:szCs w:val="30"/>
-          <w:lang w:val="th-TH"/>
         </w:rPr>
       </w:pPr>
       <w:r>

</xml_diff>

<commit_message>
fix: adjust docx templates tab stops to fix overlapping amphoe and province text (พานจังหวัด)
</commit_message>
<xml_diff>
--- a/template 1.docx
+++ b/template 1.docx
@@ -565,16 +565,16 @@
     <w:p>
       <w:pPr>
         <w:tabs>
-          <w:tab w:val="center" w:pos="1560"/>
-          <w:tab w:val="left" w:pos="2268"/>
-          <w:tab w:val="center" w:pos="2977"/>
-          <w:tab w:val="left" w:pos="3544"/>
-          <w:tab w:val="center" w:pos="4820"/>
-          <w:tab w:val="left" w:pos="5670"/>
-          <w:tab w:val="center" w:pos="6804"/>
-          <w:tab w:val="left" w:pos="7513"/>
-          <w:tab w:val="center" w:pos="8789"/>
-          <w:tab w:val="left" w:pos="9921"/>
+          <w:tab w:pos="1560" w:val="center"/>
+          <w:tab w:pos="2268" w:val="left"/>
+          <w:tab w:pos="2977" w:val="center"/>
+          <w:tab w:pos="3544" w:val="left"/>
+          <w:tab w:pos="4820" w:val="center"/>
+          <w:tab w:pos="5670" w:val="left"/>
+          <w:tab w:pos="6804" w:val="center"/>
+          <w:tab w:pos="7824" w:val="left"/>
+          <w:tab w:pos="9128" w:val="center"/>
+          <w:tab w:pos="9921" w:val="left"/>
         </w:tabs>
         <w:jc w:val="thaiDistribute"/>
         <w:rPr>
@@ -1001,16 +1001,16 @@
     <w:p>
       <w:pPr>
         <w:tabs>
-          <w:tab w:val="center" w:pos="1560"/>
-          <w:tab w:val="left" w:pos="2268"/>
-          <w:tab w:val="center" w:pos="2977"/>
-          <w:tab w:val="left" w:pos="3544"/>
-          <w:tab w:val="center" w:pos="4820"/>
-          <w:tab w:val="left" w:pos="5670"/>
-          <w:tab w:val="center" w:pos="6804"/>
-          <w:tab w:val="left" w:pos="7513"/>
-          <w:tab w:val="center" w:pos="8789"/>
-          <w:tab w:val="left" w:pos="9921"/>
+          <w:tab w:pos="1560" w:val="center"/>
+          <w:tab w:pos="2268" w:val="left"/>
+          <w:tab w:pos="2977" w:val="center"/>
+          <w:tab w:pos="3544" w:val="left"/>
+          <w:tab w:pos="4820" w:val="center"/>
+          <w:tab w:pos="5670" w:val="left"/>
+          <w:tab w:pos="6804" w:val="center"/>
+          <w:tab w:pos="7824" w:val="left"/>
+          <w:tab w:pos="9128" w:val="center"/>
+          <w:tab w:pos="9921" w:val="left"/>
         </w:tabs>
         <w:jc w:val="thaiDistribute"/>
         <w:rPr>

</xml_diff>

<commit_message>
fix: add missing tabs in paragraph 13 (shop address) of docx templates to allow proper tab stops alignment
</commit_message>
<xml_diff>
--- a/template 1.docx
+++ b/template 1.docx
@@ -1021,277 +1021,164 @@
           <w:cs/>
         </w:rPr>
       </w:pPr>
-      <w:r>
-        <w:rPr>
-          <w:rFonts w:ascii="TH Sarabun New" w:hAnsi="TH Sarabun New" w:cs="TH Sarabun New"/>
-          <w:sz w:val="30"/>
-          <w:szCs w:val="30"/>
-          <w:cs/>
-          <w:lang w:val="th-TH"/>
+      <w:r/>
+      <w:r>
+        <w:rPr>
+          <w:rFonts w:ascii="TH Sarabun New" w:hAnsi="TH Sarabun New"/>
+          <w:sz w:val="30"/>
+          <w:u w:val="none"/>
         </w:rPr>
         <w:t>ตั้งอยู่เลขที่</w:t>
       </w:r>
       <w:r>
         <w:rPr>
-          <w:rFonts w:ascii="TH Sarabun New" w:hAnsi="TH Sarabun New" w:cs="TH Sarabun New"/>
-          <w:sz w:val="30"/>
-          <w:szCs w:val="30"/>
-          <w:u w:val="dotted"/>
-          <w:cs/>
-        </w:rPr>
-        <w:tab/>
-      </w:r>
-      <w:r>
-        <w:rPr>
-          <w:rFonts w:ascii="TH Sarabun New" w:hAnsi="TH Sarabun New" w:cs="TH Sarabun New"/>
-          <w:sz w:val="30"/>
-          <w:szCs w:val="30"/>
+          <w:rFonts w:ascii="TH Sarabun New" w:hAnsi="TH Sarabun New"/>
+          <w:sz w:val="30"/>
+          <w:u w:val="dotted"/>
+        </w:rPr>
+        <w:tab/>
+      </w:r>
+      <w:r>
+        <w:rPr>
+          <w:rFonts w:ascii="TH Sarabun New" w:hAnsi="TH Sarabun New"/>
+          <w:sz w:val="30"/>
           <w:u w:val="dotted"/>
         </w:rPr>
         <w:t>{{p_shopaddr}}</w:t>
       </w:r>
       <w:r>
         <w:rPr>
-          <w:rFonts w:ascii="TH Sarabun New" w:hAnsi="TH Sarabun New" w:cs="TH Sarabun New" w:hint="cs"/>
-          <w:sz w:val="30"/>
-          <w:szCs w:val="30"/>
-          <w:u w:val="dotted"/>
-          <w:cs/>
-        </w:rPr>
-        <w:t xml:space="preserve">   </w:t>
-      </w:r>
-      <w:r>
-        <w:rPr>
-          <w:rFonts w:ascii="TH Sarabun New" w:hAnsi="TH Sarabun New" w:cs="TH Sarabun New"/>
-          <w:sz w:val="30"/>
-          <w:szCs w:val="30"/>
-          <w:cs/>
-          <w:lang w:val="th-TH"/>
+          <w:rFonts w:ascii="TH Sarabun New" w:hAnsi="TH Sarabun New"/>
+          <w:sz w:val="30"/>
+          <w:u w:val="dotted"/>
+        </w:rPr>
+        <w:tab/>
+      </w:r>
+      <w:r>
+        <w:rPr>
+          <w:rFonts w:ascii="TH Sarabun New" w:hAnsi="TH Sarabun New"/>
+          <w:sz w:val="30"/>
+          <w:u w:val="none"/>
         </w:rPr>
         <w:t>หมู่ที่</w:t>
       </w:r>
       <w:r>
         <w:rPr>
-          <w:rFonts w:ascii="TH Sarabun New" w:hAnsi="TH Sarabun New" w:cs="TH Sarabun New"/>
-          <w:sz w:val="30"/>
-          <w:szCs w:val="30"/>
-          <w:u w:val="dotted"/>
-          <w:cs/>
-        </w:rPr>
-        <w:tab/>
-      </w:r>
-      <w:r>
-        <w:rPr>
-          <w:rFonts w:ascii="TH Sarabun New" w:hAnsi="TH Sarabun New" w:cs="TH Sarabun New"/>
-          <w:sz w:val="30"/>
-          <w:szCs w:val="30"/>
-          <w:u w:val="dotted"/>
-        </w:rPr>
-        <w:t>{{p_shop</w:t>
-      </w:r>
-      <w:r>
-        <w:rPr>
-          <w:rFonts w:ascii="TH Sarabun New" w:hAnsi="TH Sarabun New" w:cs="TH Sarabun New"/>
-          <w:sz w:val="30"/>
-          <w:szCs w:val="30"/>
-          <w:u w:val="dotted"/>
-        </w:rPr>
-        <w:t>_</w:t>
-      </w:r>
-      <w:r>
-        <w:rPr>
-          <w:rFonts w:ascii="TH Sarabun New" w:hAnsi="TH Sarabun New" w:cs="TH Sarabun New"/>
-          <w:sz w:val="30"/>
-          <w:szCs w:val="30"/>
-          <w:u w:val="dotted"/>
-        </w:rPr>
-        <w:t>m}</w:t>
-      </w:r>
-      <w:r>
-        <w:rPr>
-          <w:rFonts w:ascii="TH Sarabun New" w:hAnsi="TH Sarabun New" w:cs="TH Sarabun New"/>
-          <w:sz w:val="30"/>
-          <w:szCs w:val="30"/>
-          <w:u w:val="dotted"/>
-        </w:rPr>
-        <w:t>}</w:t>
-      </w:r>
-      <w:r>
-        <w:rPr>
-          <w:rFonts w:ascii="TH Sarabun New" w:hAnsi="TH Sarabun New" w:cs="TH Sarabun New" w:hint="cs"/>
-          <w:sz w:val="30"/>
-          <w:szCs w:val="30"/>
-          <w:u w:val="dotted"/>
-          <w:cs/>
-        </w:rPr>
-        <w:t xml:space="preserve">  </w:t>
-      </w:r>
-      <w:r>
-        <w:rPr>
-          <w:rFonts w:ascii="TH Sarabun New" w:hAnsi="TH Sarabun New" w:cs="TH Sarabun New"/>
-          <w:sz w:val="30"/>
-          <w:szCs w:val="30"/>
-          <w:cs/>
-          <w:lang w:val="th-TH"/>
+          <w:rFonts w:ascii="TH Sarabun New" w:hAnsi="TH Sarabun New"/>
+          <w:sz w:val="30"/>
+          <w:u w:val="dotted"/>
+        </w:rPr>
+        <w:tab/>
+      </w:r>
+      <w:r>
+        <w:rPr>
+          <w:rFonts w:ascii="TH Sarabun New" w:hAnsi="TH Sarabun New"/>
+          <w:sz w:val="30"/>
+          <w:u w:val="dotted"/>
+        </w:rPr>
+        <w:t>{{p_shop_m}}</w:t>
+      </w:r>
+      <w:r>
+        <w:rPr>
+          <w:rFonts w:ascii="TH Sarabun New" w:hAnsi="TH Sarabun New"/>
+          <w:sz w:val="30"/>
+          <w:u w:val="dotted"/>
+        </w:rPr>
+        <w:tab/>
+      </w:r>
+      <w:r>
+        <w:rPr>
+          <w:rFonts w:ascii="TH Sarabun New" w:hAnsi="TH Sarabun New"/>
+          <w:sz w:val="30"/>
+          <w:u w:val="none"/>
         </w:rPr>
         <w:t>ตำบล</w:t>
       </w:r>
       <w:r>
         <w:rPr>
-          <w:rFonts w:ascii="TH Sarabun New" w:hAnsi="TH Sarabun New" w:cs="TH Sarabun New"/>
-          <w:sz w:val="30"/>
-          <w:szCs w:val="30"/>
-          <w:u w:val="dotted"/>
-          <w:cs/>
-        </w:rPr>
-        <w:tab/>
-      </w:r>
-      <w:r>
-        <w:rPr>
-          <w:rFonts w:ascii="TH Sarabun New" w:hAnsi="TH Sarabun New" w:cs="TH Sarabun New"/>
-          <w:sz w:val="30"/>
-          <w:szCs w:val="30"/>
-          <w:u w:val="dotted"/>
-        </w:rPr>
-        <w:t xml:space="preserve">  {</w:t>
-      </w:r>
-      <w:r>
-        <w:rPr>
-          <w:rFonts w:ascii="TH Sarabun New" w:hAnsi="TH Sarabun New" w:cs="TH Sarabun New"/>
-          <w:sz w:val="30"/>
-          <w:szCs w:val="30"/>
-          <w:u w:val="dotted"/>
-        </w:rPr>
-        <w:t>{p_shop</w:t>
-      </w:r>
-      <w:r>
-        <w:rPr>
-          <w:rFonts w:ascii="TH Sarabun New" w:hAnsi="TH Sarabun New" w:cs="TH Sarabun New"/>
-          <w:sz w:val="30"/>
-          <w:szCs w:val="30"/>
-          <w:u w:val="dotted"/>
-        </w:rPr>
-        <w:t>_</w:t>
-      </w:r>
-      <w:r>
-        <w:rPr>
-          <w:rFonts w:ascii="TH Sarabun New" w:hAnsi="TH Sarabun New" w:cs="TH Sarabun New"/>
-          <w:sz w:val="30"/>
-          <w:szCs w:val="30"/>
-          <w:u w:val="dotted"/>
-        </w:rPr>
-        <w:t>t}</w:t>
-      </w:r>
-      <w:r>
-        <w:rPr>
-          <w:rFonts w:ascii="TH Sarabun New" w:hAnsi="TH Sarabun New" w:cs="TH Sarabun New"/>
-          <w:sz w:val="30"/>
-          <w:szCs w:val="30"/>
-          <w:u w:val="dotted"/>
-        </w:rPr>
-        <w:t xml:space="preserve">}    </w:t>
-      </w:r>
-      <w:r>
-        <w:rPr>
-          <w:rFonts w:ascii="TH Sarabun New" w:hAnsi="TH Sarabun New" w:cs="TH Sarabun New"/>
-          <w:sz w:val="30"/>
-          <w:szCs w:val="30"/>
-          <w:cs/>
-          <w:lang w:val="th-TH"/>
+          <w:rFonts w:ascii="TH Sarabun New" w:hAnsi="TH Sarabun New"/>
+          <w:sz w:val="30"/>
+          <w:u w:val="dotted"/>
+        </w:rPr>
+        <w:tab/>
+      </w:r>
+      <w:r>
+        <w:rPr>
+          <w:rFonts w:ascii="TH Sarabun New" w:hAnsi="TH Sarabun New"/>
+          <w:sz w:val="30"/>
+          <w:u w:val="dotted"/>
+        </w:rPr>
+        <w:t>{{p_shop_t}}</w:t>
+      </w:r>
+      <w:r>
+        <w:rPr>
+          <w:rFonts w:ascii="TH Sarabun New" w:hAnsi="TH Sarabun New"/>
+          <w:sz w:val="30"/>
+          <w:u w:val="dotted"/>
+        </w:rPr>
+        <w:tab/>
+      </w:r>
+      <w:r>
+        <w:rPr>
+          <w:rFonts w:ascii="TH Sarabun New" w:hAnsi="TH Sarabun New"/>
+          <w:sz w:val="30"/>
+          <w:u w:val="none"/>
         </w:rPr>
         <w:t>อำเภอ</w:t>
       </w:r>
       <w:r>
         <w:rPr>
-          <w:rFonts w:ascii="TH Sarabun New" w:hAnsi="TH Sarabun New" w:cs="TH Sarabun New"/>
-          <w:sz w:val="30"/>
-          <w:szCs w:val="30"/>
-          <w:u w:val="dotted"/>
-        </w:rPr>
-        <w:t xml:space="preserve"> {</w:t>
-      </w:r>
-      <w:r>
-        <w:rPr>
-          <w:rFonts w:ascii="TH Sarabun New" w:hAnsi="TH Sarabun New" w:cs="TH Sarabun New"/>
-          <w:sz w:val="30"/>
-          <w:szCs w:val="30"/>
-          <w:u w:val="dotted"/>
-        </w:rPr>
-        <w:t>{p_shop</w:t>
-      </w:r>
-      <w:r>
-        <w:rPr>
-          <w:rFonts w:ascii="TH Sarabun New" w:hAnsi="TH Sarabun New" w:cs="TH Sarabun New"/>
-          <w:sz w:val="30"/>
-          <w:szCs w:val="30"/>
-          <w:u w:val="dotted"/>
-        </w:rPr>
-        <w:t>_</w:t>
-      </w:r>
-      <w:r>
-        <w:rPr>
-          <w:rFonts w:ascii="TH Sarabun New" w:hAnsi="TH Sarabun New" w:cs="TH Sarabun New"/>
-          <w:sz w:val="30"/>
-          <w:szCs w:val="30"/>
-          <w:u w:val="dotted"/>
-        </w:rPr>
-        <w:t>a}</w:t>
-      </w:r>
-      <w:r>
-        <w:rPr>
-          <w:rFonts w:ascii="TH Sarabun New" w:hAnsi="TH Sarabun New" w:cs="TH Sarabun New"/>
-          <w:sz w:val="30"/>
-          <w:szCs w:val="30"/>
-          <w:u w:val="dotted"/>
-        </w:rPr>
-        <w:t xml:space="preserve">}  </w:t>
-      </w:r>
-      <w:r>
-        <w:rPr>
-          <w:rFonts w:ascii="TH Sarabun New" w:hAnsi="TH Sarabun New" w:cs="TH Sarabun New"/>
-          <w:sz w:val="30"/>
-          <w:szCs w:val="30"/>
-          <w:cs/>
-          <w:lang w:val="th-TH"/>
+          <w:rFonts w:ascii="TH Sarabun New" w:hAnsi="TH Sarabun New"/>
+          <w:sz w:val="30"/>
+          <w:u w:val="dotted"/>
+        </w:rPr>
+        <w:tab/>
+      </w:r>
+      <w:r>
+        <w:rPr>
+          <w:rFonts w:ascii="TH Sarabun New" w:hAnsi="TH Sarabun New"/>
+          <w:sz w:val="30"/>
+          <w:u w:val="dotted"/>
+        </w:rPr>
+        <w:t>{{p_shop_a}}</w:t>
+      </w:r>
+      <w:r>
+        <w:rPr>
+          <w:rFonts w:ascii="TH Sarabun New" w:hAnsi="TH Sarabun New"/>
+          <w:sz w:val="30"/>
+          <w:u w:val="dotted"/>
+        </w:rPr>
+        <w:tab/>
+      </w:r>
+      <w:r>
+        <w:rPr>
+          <w:rFonts w:ascii="TH Sarabun New" w:hAnsi="TH Sarabun New"/>
+          <w:sz w:val="30"/>
+          <w:u w:val="none"/>
         </w:rPr>
         <w:t>จังหวัด</w:t>
       </w:r>
       <w:r>
         <w:rPr>
-          <w:rFonts w:ascii="TH Sarabun New" w:hAnsi="TH Sarabun New" w:cs="TH Sarabun New"/>
-          <w:sz w:val="30"/>
-          <w:szCs w:val="30"/>
-          <w:u w:val="dotted"/>
-          <w:cs/>
-        </w:rPr>
-        <w:tab/>
-      </w:r>
-      <w:r>
-        <w:rPr>
-          <w:rFonts w:ascii="TH Sarabun New" w:hAnsi="TH Sarabun New" w:cs="TH Sarabun New"/>
-          <w:sz w:val="30"/>
-          <w:szCs w:val="30"/>
-          <w:u w:val="dotted"/>
-        </w:rPr>
-        <w:t xml:space="preserve"> </w:t>
-      </w:r>
-      <w:r>
-        <w:rPr>
-          <w:rFonts w:ascii="TH Sarabun New" w:hAnsi="TH Sarabun New" w:cs="TH Sarabun New"/>
-          <w:sz w:val="30"/>
-          <w:szCs w:val="30"/>
+          <w:rFonts w:ascii="TH Sarabun New" w:hAnsi="TH Sarabun New"/>
+          <w:sz w:val="30"/>
+          <w:u w:val="dotted"/>
+        </w:rPr>
+        <w:tab/>
+      </w:r>
+      <w:r>
+        <w:rPr>
+          <w:rFonts w:ascii="TH Sarabun New" w:hAnsi="TH Sarabun New"/>
+          <w:sz w:val="30"/>
           <w:u w:val="dotted"/>
         </w:rPr>
         <w:t>{{p_shop_p}}</w:t>
       </w:r>
       <w:r>
         <w:rPr>
-          <w:rFonts w:ascii="TH Sarabun New" w:hAnsi="TH Sarabun New" w:cs="TH Sarabun New"/>
-          <w:sz w:val="30"/>
-          <w:szCs w:val="30"/>
-          <w:u w:val="dotted"/>
-          <w:cs/>
-          <w:lang w:val="th-TH"/>
+          <w:rFonts w:ascii="TH Sarabun New" w:hAnsi="TH Sarabun New"/>
+          <w:sz w:val="30"/>
+          <w:u w:val="dotted"/>
         </w:rPr>
         <w:tab/>
       </w:r>

</xml_diff>

<commit_message>
fix: tighten docx templates tab stops and reduce request form trailing space padding to solve spacing issues
</commit_message>
<xml_diff>
--- a/template 1.docx
+++ b/template 1.docx
@@ -565,15 +565,15 @@
     <w:p>
       <w:pPr>
         <w:tabs>
-          <w:tab w:pos="1560" w:val="center"/>
+          <w:tab w:pos="1559" w:val="center"/>
           <w:tab w:pos="2268" w:val="left"/>
-          <w:tab w:pos="2977" w:val="center"/>
-          <w:tab w:pos="3544" w:val="left"/>
-          <w:tab w:pos="4820" w:val="center"/>
-          <w:tab w:pos="5670" w:val="left"/>
-          <w:tab w:pos="6804" w:val="center"/>
-          <w:tab w:pos="7824" w:val="left"/>
-          <w:tab w:pos="9128" w:val="center"/>
+          <w:tab w:pos="2976" w:val="center"/>
+          <w:tab w:pos="3543" w:val="left"/>
+          <w:tab w:pos="4819" w:val="center"/>
+          <w:tab w:pos="5669" w:val="left"/>
+          <w:tab w:pos="6803" w:val="center"/>
+          <w:tab w:pos="7512" w:val="left"/>
+          <w:tab w:pos="8787" w:val="center"/>
           <w:tab w:pos="9921" w:val="left"/>
         </w:tabs>
         <w:jc w:val="thaiDistribute"/>
@@ -938,9 +938,9 @@
     <w:p>
       <w:pPr>
         <w:tabs>
-          <w:tab w:val="left" w:pos="1418"/>
-          <w:tab w:val="center" w:pos="5103"/>
-          <w:tab w:val="left" w:pos="9921"/>
+          <w:tab w:pos="1020" w:val="left"/>
+          <w:tab w:pos="5102" w:val="center"/>
+          <w:tab w:pos="9921" w:val="left"/>
         </w:tabs>
         <w:jc w:val="thaiDistribute"/>
         <w:rPr>
@@ -1001,15 +1001,15 @@
     <w:p>
       <w:pPr>
         <w:tabs>
-          <w:tab w:pos="1560" w:val="center"/>
+          <w:tab w:pos="1559" w:val="center"/>
           <w:tab w:pos="2268" w:val="left"/>
-          <w:tab w:pos="2977" w:val="center"/>
-          <w:tab w:pos="3544" w:val="left"/>
-          <w:tab w:pos="4820" w:val="center"/>
-          <w:tab w:pos="5670" w:val="left"/>
-          <w:tab w:pos="6804" w:val="center"/>
-          <w:tab w:pos="7824" w:val="left"/>
-          <w:tab w:pos="9128" w:val="center"/>
+          <w:tab w:pos="2976" w:val="center"/>
+          <w:tab w:pos="3543" w:val="left"/>
+          <w:tab w:pos="4819" w:val="center"/>
+          <w:tab w:pos="5669" w:val="left"/>
+          <w:tab w:pos="6803" w:val="center"/>
+          <w:tab w:pos="7512" w:val="left"/>
+          <w:tab w:pos="8787" w:val="center"/>
           <w:tab w:pos="9921" w:val="left"/>
         </w:tabs>
         <w:jc w:val="thaiDistribute"/>

</xml_diff>

<commit_message>
fix: adjust docx templates tab stops for Paragraph 7 and remove nationality run underlines for Paragraph 8
</commit_message>
<xml_diff>
--- a/template 1.docx
+++ b/template 1.docx
@@ -325,12 +325,8 @@
     <w:p>
       <w:pPr>
         <w:tabs>
-          <w:tab w:val="center" w:pos="720"/>
-          <w:tab w:val="left" w:pos="1200"/>
-          <w:tab w:val="center" w:pos="1985"/>
-          <w:tab w:val="left" w:pos="2552"/>
-          <w:tab w:val="center" w:pos="3261"/>
-          <w:tab w:val="left" w:pos="3828"/>
+          <w:tab w:pos="1247" w:val="left"/>
+          <w:tab w:pos="2608" w:val="left"/>
         </w:tabs>
         <w:spacing w:before="120"/>
         <w:jc w:val="thaiDistribute"/>
@@ -421,7 +417,7 @@
           <w:rFonts w:ascii="TH Sarabun New" w:hAnsi="TH Sarabun New" w:cs="TH Sarabun New"/>
           <w:sz w:val="30"/>
           <w:szCs w:val="30"/>
-          <w:u w:val="dotted"/>
+          <w:u w:val="none"/>
         </w:rPr>
         <w:t xml:space="preserve"> </w:t>
       </w:r>
@@ -440,7 +436,7 @@
           <w:rFonts w:ascii="TH Sarabun New" w:hAnsi="TH Sarabun New" w:cs="TH Sarabun New"/>
           <w:sz w:val="30"/>
           <w:szCs w:val="30"/>
-          <w:u w:val="dotted"/>
+          <w:u w:val="none"/>
         </w:rPr>
         <w:t xml:space="preserve">   </w:t>
       </w:r>
@@ -449,7 +445,7 @@
           <w:rFonts w:ascii="TH Sarabun New" w:hAnsi="TH Sarabun New" w:cs="TH Sarabun New"/>
           <w:sz w:val="30"/>
           <w:szCs w:val="30"/>
-          <w:u w:val="dotted"/>
+          <w:u w:val="none"/>
         </w:rPr>
         <w:t>{{p_license_year}}</w:t>
       </w:r>
@@ -458,7 +454,7 @@
           <w:rFonts w:ascii="TH Sarabun New" w:hAnsi="TH Sarabun New" w:cs="TH Sarabun New" w:hint="cs"/>
           <w:sz w:val="30"/>
           <w:szCs w:val="30"/>
-          <w:u w:val="dotted"/>
+          <w:u w:val="none"/>
           <w:cs/>
         </w:rPr>
         <w:t xml:space="preserve"> </w:t>
@@ -557,7 +553,7 @@
           <w:rFonts w:ascii="TH Sarabun New" w:hAnsi="TH Sarabun New" w:cs="TH Sarabun New"/>
           <w:sz w:val="30"/>
           <w:szCs w:val="30"/>
-          <w:u w:val="dotted"/>
+          <w:u w:val="none"/>
         </w:rPr>
         <w:t>{{p_nationality}}</w:t>
       </w:r>

</xml_diff>

<commit_message>
Revert "fix: adjust docx templates tab stops for Paragraph 7 and remove nationality run underlines for Paragraph 8"
This reverts commit f484d413227378753e7d0bf01e169de7db3474c0.
</commit_message>
<xml_diff>
--- a/template 1.docx
+++ b/template 1.docx
@@ -325,8 +325,12 @@
     <w:p>
       <w:pPr>
         <w:tabs>
-          <w:tab w:pos="1247" w:val="left"/>
-          <w:tab w:pos="2608" w:val="left"/>
+          <w:tab w:val="center" w:pos="720"/>
+          <w:tab w:val="left" w:pos="1200"/>
+          <w:tab w:val="center" w:pos="1985"/>
+          <w:tab w:val="left" w:pos="2552"/>
+          <w:tab w:val="center" w:pos="3261"/>
+          <w:tab w:val="left" w:pos="3828"/>
         </w:tabs>
         <w:spacing w:before="120"/>
         <w:jc w:val="thaiDistribute"/>
@@ -417,7 +421,7 @@
           <w:rFonts w:ascii="TH Sarabun New" w:hAnsi="TH Sarabun New" w:cs="TH Sarabun New"/>
           <w:sz w:val="30"/>
           <w:szCs w:val="30"/>
-          <w:u w:val="none"/>
+          <w:u w:val="dotted"/>
         </w:rPr>
         <w:t xml:space="preserve"> </w:t>
       </w:r>
@@ -436,7 +440,7 @@
           <w:rFonts w:ascii="TH Sarabun New" w:hAnsi="TH Sarabun New" w:cs="TH Sarabun New"/>
           <w:sz w:val="30"/>
           <w:szCs w:val="30"/>
-          <w:u w:val="none"/>
+          <w:u w:val="dotted"/>
         </w:rPr>
         <w:t xml:space="preserve">   </w:t>
       </w:r>
@@ -445,7 +449,7 @@
           <w:rFonts w:ascii="TH Sarabun New" w:hAnsi="TH Sarabun New" w:cs="TH Sarabun New"/>
           <w:sz w:val="30"/>
           <w:szCs w:val="30"/>
-          <w:u w:val="none"/>
+          <w:u w:val="dotted"/>
         </w:rPr>
         <w:t>{{p_license_year}}</w:t>
       </w:r>
@@ -454,7 +458,7 @@
           <w:rFonts w:ascii="TH Sarabun New" w:hAnsi="TH Sarabun New" w:cs="TH Sarabun New" w:hint="cs"/>
           <w:sz w:val="30"/>
           <w:szCs w:val="30"/>
-          <w:u w:val="none"/>
+          <w:u w:val="dotted"/>
           <w:cs/>
         </w:rPr>
         <w:t xml:space="preserve"> </w:t>
@@ -553,7 +557,7 @@
           <w:rFonts w:ascii="TH Sarabun New" w:hAnsi="TH Sarabun New" w:cs="TH Sarabun New"/>
           <w:sz w:val="30"/>
           <w:szCs w:val="30"/>
-          <w:u w:val="none"/>
+          <w:u w:val="dotted"/>
         </w:rPr>
         <w:t>{{p_nationality}}</w:t>
       </w:r>

</xml_diff>

<commit_message>
fix: rebuild docx templates paragraph 7 with 5 tabs and wide tab stops for balanced distributed layout
</commit_message>
<xml_diff>
--- a/template 1.docx
+++ b/template 1.docx
@@ -325,12 +325,11 @@
     <w:p>
       <w:pPr>
         <w:tabs>
-          <w:tab w:val="center" w:pos="720"/>
-          <w:tab w:val="left" w:pos="1200"/>
-          <w:tab w:val="center" w:pos="1985"/>
-          <w:tab w:val="left" w:pos="2552"/>
-          <w:tab w:val="center" w:pos="3261"/>
-          <w:tab w:val="left" w:pos="3828"/>
+          <w:tab w:pos="1417" w:val="left"/>
+          <w:tab w:pos="3402" w:val="left"/>
+          <w:tab w:pos="4535" w:val="left"/>
+          <w:tab w:pos="6803" w:val="left"/>
+          <w:tab w:pos="7654" w:val="left"/>
         </w:tabs>
         <w:spacing w:before="120"/>
         <w:jc w:val="thaiDistribute"/>
@@ -341,13 +340,12 @@
           <w:u w:val="dotted"/>
         </w:rPr>
       </w:pPr>
-      <w:r>
-        <w:rPr>
-          <w:rFonts w:ascii="TH Sarabun New" w:hAnsi="TH Sarabun New" w:cs="TH Sarabun New"/>
-          <w:sz w:val="30"/>
-          <w:szCs w:val="30"/>
-          <w:cs/>
-          <w:lang w:val="th-TH"/>
+      <w:r/>
+      <w:r>
+        <w:rPr>
+          <w:rFonts w:ascii="TH Sarabun New" w:hAnsi="TH Sarabun New" w:cs="TH Sarabun New"/>
+          <w:sz w:val="30"/>
+          <w:u w:val="none"/>
         </w:rPr>
         <w:t>เล่มที่</w:t>
       </w:r>
@@ -355,17 +353,14 @@
         <w:rPr>
           <w:rFonts w:ascii="TH Sarabun New" w:hAnsi="TH Sarabun New" w:cs="TH Sarabun New"/>
           <w:sz w:val="30"/>
-          <w:szCs w:val="30"/>
-          <w:u w:val="dotted"/>
-          <w:cs/>
-        </w:rPr>
-        <w:tab/>
-      </w:r>
-      <w:r>
-        <w:rPr>
-          <w:rFonts w:ascii="TH Sarabun New" w:hAnsi="TH Sarabun New" w:cs="TH Sarabun New"/>
-          <w:sz w:val="30"/>
-          <w:szCs w:val="30"/>
+          <w:u w:val="dotted"/>
+        </w:rPr>
+        <w:tab/>
+      </w:r>
+      <w:r>
+        <w:rPr>
+          <w:rFonts w:ascii="TH Sarabun New" w:hAnsi="TH Sarabun New" w:cs="TH Sarabun New"/>
+          <w:sz w:val="30"/>
           <w:u w:val="dotted"/>
         </w:rPr>
         <w:t>{{p_license_book}}</w:t>
@@ -374,18 +369,15 @@
         <w:rPr>
           <w:rFonts w:ascii="TH Sarabun New" w:hAnsi="TH Sarabun New" w:cs="TH Sarabun New"/>
           <w:sz w:val="30"/>
-          <w:szCs w:val="30"/>
-          <w:u w:val="dotted"/>
-        </w:rPr>
-        <w:t xml:space="preserve">   </w:t>
-      </w:r>
-      <w:r>
-        <w:rPr>
-          <w:rFonts w:ascii="TH Sarabun New" w:hAnsi="TH Sarabun New" w:cs="TH Sarabun New"/>
-          <w:sz w:val="30"/>
-          <w:szCs w:val="30"/>
-          <w:cs/>
-          <w:lang w:val="th-TH"/>
+          <w:u w:val="none"/>
+        </w:rPr>
+        <w:tab/>
+      </w:r>
+      <w:r>
+        <w:rPr>
+          <w:rFonts w:ascii="TH Sarabun New" w:hAnsi="TH Sarabun New" w:cs="TH Sarabun New"/>
+          <w:sz w:val="30"/>
+          <w:u w:val="none"/>
         </w:rPr>
         <w:t>เลขที่</w:t>
       </w:r>
@@ -393,25 +385,14 @@
         <w:rPr>
           <w:rFonts w:ascii="TH Sarabun New" w:hAnsi="TH Sarabun New" w:cs="TH Sarabun New"/>
           <w:sz w:val="30"/>
-          <w:szCs w:val="30"/>
-        </w:rPr>
-        <w:t xml:space="preserve">  </w:t>
-      </w:r>
-      <w:r>
-        <w:rPr>
-          <w:rFonts w:ascii="TH Sarabun New" w:hAnsi="TH Sarabun New" w:cs="TH Sarabun New"/>
-          <w:sz w:val="30"/>
-          <w:szCs w:val="30"/>
-          <w:u w:val="dotted"/>
-          <w:cs/>
-        </w:rPr>
-        <w:tab/>
-      </w:r>
-      <w:r>
-        <w:rPr>
-          <w:rFonts w:ascii="TH Sarabun New" w:hAnsi="TH Sarabun New" w:cs="TH Sarabun New"/>
-          <w:sz w:val="30"/>
-          <w:szCs w:val="30"/>
+          <w:u w:val="dotted"/>
+        </w:rPr>
+        <w:tab/>
+      </w:r>
+      <w:r>
+        <w:rPr>
+          <w:rFonts w:ascii="TH Sarabun New" w:hAnsi="TH Sarabun New" w:cs="TH Sarabun New"/>
+          <w:sz w:val="30"/>
           <w:u w:val="dotted"/>
         </w:rPr>
         <w:t>{{p_license_no}}</w:t>
@@ -420,18 +401,15 @@
         <w:rPr>
           <w:rFonts w:ascii="TH Sarabun New" w:hAnsi="TH Sarabun New" w:cs="TH Sarabun New"/>
           <w:sz w:val="30"/>
-          <w:szCs w:val="30"/>
-          <w:u w:val="dotted"/>
-        </w:rPr>
-        <w:t xml:space="preserve"> </w:t>
-      </w:r>
-      <w:r>
-        <w:rPr>
-          <w:rFonts w:ascii="TH Sarabun New" w:hAnsi="TH Sarabun New" w:cs="TH Sarabun New"/>
-          <w:sz w:val="30"/>
-          <w:szCs w:val="30"/>
-          <w:cs/>
-          <w:lang w:val="th-TH"/>
+          <w:u w:val="none"/>
+        </w:rPr>
+        <w:tab/>
+      </w:r>
+      <w:r>
+        <w:rPr>
+          <w:rFonts w:ascii="TH Sarabun New" w:hAnsi="TH Sarabun New" w:cs="TH Sarabun New"/>
+          <w:sz w:val="30"/>
+          <w:u w:val="none"/>
         </w:rPr>
         <w:t>ปี</w:t>
       </w:r>
@@ -439,27 +417,23 @@
         <w:rPr>
           <w:rFonts w:ascii="TH Sarabun New" w:hAnsi="TH Sarabun New" w:cs="TH Sarabun New"/>
           <w:sz w:val="30"/>
-          <w:szCs w:val="30"/>
-          <w:u w:val="dotted"/>
-        </w:rPr>
-        <w:t xml:space="preserve">   </w:t>
-      </w:r>
-      <w:r>
-        <w:rPr>
-          <w:rFonts w:ascii="TH Sarabun New" w:hAnsi="TH Sarabun New" w:cs="TH Sarabun New"/>
-          <w:sz w:val="30"/>
-          <w:szCs w:val="30"/>
-          <w:u w:val="dotted"/>
+          <w:u w:val="dotted"/>
+        </w:rPr>
+        <w:tab/>
+      </w:r>
+      <w:r>
+        <w:rPr>
+          <w:rFonts w:ascii="TH Sarabun New" w:hAnsi="TH Sarabun New" w:cs="TH Sarabun New"/>
+          <w:sz w:val="30"/>
+          <w:u w:val="none"/>
         </w:rPr>
         <w:t>{{p_license_year}}</w:t>
       </w:r>
       <w:r>
         <w:rPr>
-          <w:rFonts w:ascii="TH Sarabun New" w:hAnsi="TH Sarabun New" w:cs="TH Sarabun New" w:hint="cs"/>
-          <w:sz w:val="30"/>
-          <w:szCs w:val="30"/>
-          <w:u w:val="dotted"/>
-          <w:cs/>
+          <w:rFonts w:ascii="TH Sarabun New" w:hAnsi="TH Sarabun New" w:cs="TH Sarabun New"/>
+          <w:sz w:val="30"/>
+          <w:u w:val="none"/>
         </w:rPr>
         <w:t xml:space="preserve"> </w:t>
       </w:r>
@@ -557,7 +531,7 @@
           <w:rFonts w:ascii="TH Sarabun New" w:hAnsi="TH Sarabun New" w:cs="TH Sarabun New"/>
           <w:sz w:val="30"/>
           <w:szCs w:val="30"/>
-          <w:u w:val="dotted"/>
+          <w:u w:val="none"/>
         </w:rPr>
         <w:t>{{p_nationality}}</w:t>
       </w:r>

</xml_diff>

<commit_message>
fix: adjust docx templates paragraph 7 to be left-aligned with left indent and sequential tab stops
</commit_message>
<xml_diff>
--- a/template 1.docx
+++ b/template 1.docx
@@ -325,14 +325,13 @@
     <w:p>
       <w:pPr>
         <w:tabs>
-          <w:tab w:pos="1417" w:val="left"/>
-          <w:tab w:pos="3402" w:val="left"/>
-          <w:tab w:pos="4535" w:val="left"/>
-          <w:tab w:pos="6803" w:val="left"/>
+          <w:tab w:pos="2551" w:val="left"/>
+          <w:tab w:pos="4819" w:val="left"/>
           <w:tab w:pos="7654" w:val="left"/>
         </w:tabs>
         <w:spacing w:before="120"/>
-        <w:jc w:val="thaiDistribute"/>
+        <w:ind w:left="1247"/>
+        <w:jc w:val="left"/>
         <w:rPr>
           <w:rFonts w:ascii="TH Sarabun New" w:hAnsi="TH Sarabun New" w:cs="TH Sarabun New"/>
           <w:sz w:val="30"/>
@@ -371,7 +370,23 @@
           <w:sz w:val="30"/>
           <w:u w:val="none"/>
         </w:rPr>
-        <w:tab/>
+        <w:t xml:space="preserve">   เลขที่</w:t>
+      </w:r>
+      <w:r>
+        <w:rPr>
+          <w:rFonts w:ascii="TH Sarabun New" w:hAnsi="TH Sarabun New" w:cs="TH Sarabun New"/>
+          <w:sz w:val="30"/>
+          <w:u w:val="dotted"/>
+        </w:rPr>
+        <w:tab/>
+      </w:r>
+      <w:r>
+        <w:rPr>
+          <w:rFonts w:ascii="TH Sarabun New" w:hAnsi="TH Sarabun New" w:cs="TH Sarabun New"/>
+          <w:sz w:val="30"/>
+          <w:u w:val="dotted"/>
+        </w:rPr>
+        <w:t>{{p_license_no}}</w:t>
       </w:r>
       <w:r>
         <w:rPr>
@@ -379,39 +394,7 @@
           <w:sz w:val="30"/>
           <w:u w:val="none"/>
         </w:rPr>
-        <w:t>เลขที่</w:t>
-      </w:r>
-      <w:r>
-        <w:rPr>
-          <w:rFonts w:ascii="TH Sarabun New" w:hAnsi="TH Sarabun New" w:cs="TH Sarabun New"/>
-          <w:sz w:val="30"/>
-          <w:u w:val="dotted"/>
-        </w:rPr>
-        <w:tab/>
-      </w:r>
-      <w:r>
-        <w:rPr>
-          <w:rFonts w:ascii="TH Sarabun New" w:hAnsi="TH Sarabun New" w:cs="TH Sarabun New"/>
-          <w:sz w:val="30"/>
-          <w:u w:val="dotted"/>
-        </w:rPr>
-        <w:t>{{p_license_no}}</w:t>
-      </w:r>
-      <w:r>
-        <w:rPr>
-          <w:rFonts w:ascii="TH Sarabun New" w:hAnsi="TH Sarabun New" w:cs="TH Sarabun New"/>
-          <w:sz w:val="30"/>
-          <w:u w:val="none"/>
-        </w:rPr>
-        <w:tab/>
-      </w:r>
-      <w:r>
-        <w:rPr>
-          <w:rFonts w:ascii="TH Sarabun New" w:hAnsi="TH Sarabun New" w:cs="TH Sarabun New"/>
-          <w:sz w:val="30"/>
-          <w:u w:val="none"/>
-        </w:rPr>
-        <w:t>ปี</w:t>
+        <w:t xml:space="preserve">   ปี</w:t>
       </w:r>
       <w:r>
         <w:rPr>

</xml_diff>

<commit_message>
fix: adjust docx templates paragraph 7 to be distributed alignment with 5 tabs and dotted year underline
</commit_message>
<xml_diff>
--- a/template 1.docx
+++ b/template 1.docx
@@ -325,13 +325,15 @@
     <w:p>
       <w:pPr>
         <w:tabs>
-          <w:tab w:pos="2551" w:val="left"/>
+          <w:tab w:pos="1984" w:val="left"/>
+          <w:tab w:pos="2665" w:val="left"/>
           <w:tab w:pos="4819" w:val="left"/>
+          <w:tab w:pos="5499" w:val="left"/>
           <w:tab w:pos="7654" w:val="left"/>
         </w:tabs>
         <w:spacing w:before="120"/>
-        <w:ind w:left="1247"/>
-        <w:jc w:val="left"/>
+        <w:ind w:left="0"/>
+        <w:jc w:val="distribute"/>
         <w:rPr>
           <w:rFonts w:ascii="TH Sarabun New" w:hAnsi="TH Sarabun New" w:cs="TH Sarabun New"/>
           <w:sz w:val="30"/>
@@ -370,7 +372,15 @@
           <w:sz w:val="30"/>
           <w:u w:val="none"/>
         </w:rPr>
-        <w:t xml:space="preserve">   เลขที่</w:t>
+        <w:tab/>
+      </w:r>
+      <w:r>
+        <w:rPr>
+          <w:rFonts w:ascii="TH Sarabun New" w:hAnsi="TH Sarabun New" w:cs="TH Sarabun New"/>
+          <w:sz w:val="30"/>
+          <w:u w:val="none"/>
+        </w:rPr>
+        <w:t>เลขที่</w:t>
       </w:r>
       <w:r>
         <w:rPr>
@@ -394,14 +404,6 @@
           <w:sz w:val="30"/>
           <w:u w:val="none"/>
         </w:rPr>
-        <w:t xml:space="preserve">   ปี</w:t>
-      </w:r>
-      <w:r>
-        <w:rPr>
-          <w:rFonts w:ascii="TH Sarabun New" w:hAnsi="TH Sarabun New" w:cs="TH Sarabun New"/>
-          <w:sz w:val="30"/>
-          <w:u w:val="dotted"/>
-        </w:rPr>
         <w:tab/>
       </w:r>
       <w:r>
@@ -409,6 +411,22 @@
           <w:rFonts w:ascii="TH Sarabun New" w:hAnsi="TH Sarabun New" w:cs="TH Sarabun New"/>
           <w:sz w:val="30"/>
           <w:u w:val="none"/>
+        </w:rPr>
+        <w:t>ปี</w:t>
+      </w:r>
+      <w:r>
+        <w:rPr>
+          <w:rFonts w:ascii="TH Sarabun New" w:hAnsi="TH Sarabun New" w:cs="TH Sarabun New"/>
+          <w:sz w:val="30"/>
+          <w:u w:val="dotted"/>
+        </w:rPr>
+        <w:tab/>
+      </w:r>
+      <w:r>
+        <w:rPr>
+          <w:rFonts w:ascii="TH Sarabun New" w:hAnsi="TH Sarabun New" w:cs="TH Sarabun New"/>
+          <w:sz w:val="30"/>
+          <w:u w:val="dotted"/>
         </w:rPr>
         <w:t>{{p_license_year}}</w:t>
       </w:r>

</xml_diff>

<commit_message>
fix: adjust docx templates paragraph 7 to be left-aligned and compact layout with 3 tabs
</commit_message>
<xml_diff>
--- a/template 1.docx
+++ b/template 1.docx
@@ -325,15 +325,13 @@
     <w:p>
       <w:pPr>
         <w:tabs>
-          <w:tab w:pos="1984" w:val="left"/>
-          <w:tab w:pos="2665" w:val="left"/>
-          <w:tab w:pos="4819" w:val="left"/>
-          <w:tab w:pos="5499" w:val="left"/>
-          <w:tab w:pos="7654" w:val="left"/>
+          <w:tab w:pos="1814" w:val="left"/>
+          <w:tab w:pos="3685" w:val="left"/>
+          <w:tab w:pos="4989" w:val="left"/>
         </w:tabs>
         <w:spacing w:before="120"/>
         <w:ind w:left="0"/>
-        <w:jc w:val="distribute"/>
+        <w:jc w:val="left"/>
         <w:rPr>
           <w:rFonts w:ascii="TH Sarabun New" w:hAnsi="TH Sarabun New" w:cs="TH Sarabun New"/>
           <w:sz w:val="30"/>
@@ -348,7 +346,7 @@
           <w:sz w:val="30"/>
           <w:u w:val="none"/>
         </w:rPr>
-        <w:t>เล่มที่</w:t>
+        <w:t xml:space="preserve">     เล่มที่</w:t>
       </w:r>
       <w:r>
         <w:rPr>
@@ -372,7 +370,23 @@
           <w:sz w:val="30"/>
           <w:u w:val="none"/>
         </w:rPr>
-        <w:tab/>
+        <w:t xml:space="preserve">   เลขที่</w:t>
+      </w:r>
+      <w:r>
+        <w:rPr>
+          <w:rFonts w:ascii="TH Sarabun New" w:hAnsi="TH Sarabun New" w:cs="TH Sarabun New"/>
+          <w:sz w:val="30"/>
+          <w:u w:val="dotted"/>
+        </w:rPr>
+        <w:tab/>
+      </w:r>
+      <w:r>
+        <w:rPr>
+          <w:rFonts w:ascii="TH Sarabun New" w:hAnsi="TH Sarabun New" w:cs="TH Sarabun New"/>
+          <w:sz w:val="30"/>
+          <w:u w:val="dotted"/>
+        </w:rPr>
+        <w:t>{{p_license_no}}</w:t>
       </w:r>
       <w:r>
         <w:rPr>
@@ -380,39 +394,7 @@
           <w:sz w:val="30"/>
           <w:u w:val="none"/>
         </w:rPr>
-        <w:t>เลขที่</w:t>
-      </w:r>
-      <w:r>
-        <w:rPr>
-          <w:rFonts w:ascii="TH Sarabun New" w:hAnsi="TH Sarabun New" w:cs="TH Sarabun New"/>
-          <w:sz w:val="30"/>
-          <w:u w:val="dotted"/>
-        </w:rPr>
-        <w:tab/>
-      </w:r>
-      <w:r>
-        <w:rPr>
-          <w:rFonts w:ascii="TH Sarabun New" w:hAnsi="TH Sarabun New" w:cs="TH Sarabun New"/>
-          <w:sz w:val="30"/>
-          <w:u w:val="dotted"/>
-        </w:rPr>
-        <w:t>{{p_license_no}}</w:t>
-      </w:r>
-      <w:r>
-        <w:rPr>
-          <w:rFonts w:ascii="TH Sarabun New" w:hAnsi="TH Sarabun New" w:cs="TH Sarabun New"/>
-          <w:sz w:val="30"/>
-          <w:u w:val="none"/>
-        </w:rPr>
-        <w:tab/>
-      </w:r>
-      <w:r>
-        <w:rPr>
-          <w:rFonts w:ascii="TH Sarabun New" w:hAnsi="TH Sarabun New" w:cs="TH Sarabun New"/>
-          <w:sz w:val="30"/>
-          <w:u w:val="none"/>
-        </w:rPr>
-        <w:t>ปี</w:t>
+        <w:t xml:space="preserve">   ปี</w:t>
       </w:r>
       <w:r>
         <w:rPr>

</xml_diff>

<commit_message>
fix: adjust docx templates paragraph 7 to center-align the values inside the dotted lines
</commit_message>
<xml_diff>
--- a/template 1.docx
+++ b/template 1.docx
@@ -325,9 +325,12 @@
     <w:p>
       <w:pPr>
         <w:tabs>
-          <w:tab w:pos="1814" w:val="left"/>
-          <w:tab w:pos="3685" w:val="left"/>
-          <w:tab w:pos="4989" w:val="left"/>
+          <w:tab w:pos="1701" w:val="center"/>
+          <w:tab w:pos="2551" w:val="left"/>
+          <w:tab w:pos="4082" w:val="center"/>
+          <w:tab w:pos="5102" w:val="left"/>
+          <w:tab w:pos="6236" w:val="center"/>
+          <w:tab w:pos="7370" w:val="left"/>
         </w:tabs>
         <w:spacing w:before="120"/>
         <w:ind w:left="0"/>
@@ -368,9 +371,17 @@
         <w:rPr>
           <w:rFonts w:ascii="TH Sarabun New" w:hAnsi="TH Sarabun New" w:cs="TH Sarabun New"/>
           <w:sz w:val="30"/>
+          <w:u w:val="dotted"/>
+        </w:rPr>
+        <w:tab/>
+      </w:r>
+      <w:r>
+        <w:rPr>
+          <w:rFonts w:ascii="TH Sarabun New" w:hAnsi="TH Sarabun New" w:cs="TH Sarabun New"/>
+          <w:sz w:val="30"/>
           <w:u w:val="none"/>
         </w:rPr>
-        <w:t xml:space="preserve">   เลขที่</w:t>
+        <w:t>เลขที่</w:t>
       </w:r>
       <w:r>
         <w:rPr>
@@ -392,9 +403,17 @@
         <w:rPr>
           <w:rFonts w:ascii="TH Sarabun New" w:hAnsi="TH Sarabun New" w:cs="TH Sarabun New"/>
           <w:sz w:val="30"/>
+          <w:u w:val="dotted"/>
+        </w:rPr>
+        <w:tab/>
+      </w:r>
+      <w:r>
+        <w:rPr>
+          <w:rFonts w:ascii="TH Sarabun New" w:hAnsi="TH Sarabun New" w:cs="TH Sarabun New"/>
+          <w:sz w:val="30"/>
           <w:u w:val="none"/>
         </w:rPr>
-        <w:t xml:space="preserve">   ปี</w:t>
+        <w:t>ปี</w:t>
       </w:r>
       <w:r>
         <w:rPr>
@@ -411,6 +430,14 @@
           <w:u w:val="dotted"/>
         </w:rPr>
         <w:t>{{p_license_year}}</w:t>
+      </w:r>
+      <w:r>
+        <w:rPr>
+          <w:rFonts w:ascii="TH Sarabun New" w:hAnsi="TH Sarabun New" w:cs="TH Sarabun New"/>
+          <w:sz w:val="30"/>
+          <w:u w:val="dotted"/>
+        </w:rPr>
+        <w:tab/>
       </w:r>
       <w:r>
         <w:rPr>

</xml_diff>

<commit_message>
fix: adjust docx templates paragraph 7 tab stops to shorten value centering gaps
</commit_message>
<xml_diff>
--- a/template 1.docx
+++ b/template 1.docx
@@ -327,10 +327,10 @@
         <w:tabs>
           <w:tab w:pos="1701" w:val="center"/>
           <w:tab w:pos="2551" w:val="left"/>
-          <w:tab w:pos="4082" w:val="center"/>
-          <w:tab w:pos="5102" w:val="left"/>
-          <w:tab w:pos="6236" w:val="center"/>
-          <w:tab w:pos="7370" w:val="left"/>
+          <w:tab w:pos="3685" w:val="center"/>
+          <w:tab w:pos="4422" w:val="left"/>
+          <w:tab w:pos="5386" w:val="center"/>
+          <w:tab w:pos="6236" w:val="left"/>
         </w:tabs>
         <w:spacing w:before="120"/>
         <w:ind w:left="0"/>

</xml_diff>

<commit_message>
fix: resolve docx templates paragraph 7 tab stops using native word tab leaders to fix centering and blank underlines
</commit_message>
<xml_diff>
--- a/template 1.docx
+++ b/template 1.docx
@@ -325,12 +325,12 @@
     <w:p>
       <w:pPr>
         <w:tabs>
-          <w:tab w:pos="1701" w:val="center"/>
-          <w:tab w:pos="2551" w:val="left"/>
-          <w:tab w:pos="3685" w:val="center"/>
-          <w:tab w:pos="4422" w:val="left"/>
-          <w:tab w:pos="5386" w:val="center"/>
-          <w:tab w:pos="6236" w:val="left"/>
+          <w:tab w:pos="1701" w:val="center" w:leader="dot"/>
+          <w:tab w:pos="2324" w:val="left" w:leader="dot"/>
+          <w:tab w:pos="3628" w:val="center" w:leader="dot"/>
+          <w:tab w:pos="4252" w:val="left" w:leader="dot"/>
+          <w:tab w:pos="5102" w:val="center" w:leader="dot"/>
+          <w:tab w:pos="5726" w:val="left" w:leader="dot"/>
         </w:tabs>
         <w:spacing w:before="120"/>
         <w:ind w:left="0"/>
@@ -355,15 +355,15 @@
         <w:rPr>
           <w:rFonts w:ascii="TH Sarabun New" w:hAnsi="TH Sarabun New" w:cs="TH Sarabun New"/>
           <w:sz w:val="30"/>
-          <w:u w:val="dotted"/>
-        </w:rPr>
-        <w:tab/>
-      </w:r>
-      <w:r>
-        <w:rPr>
-          <w:rFonts w:ascii="TH Sarabun New" w:hAnsi="TH Sarabun New" w:cs="TH Sarabun New"/>
-          <w:sz w:val="30"/>
-          <w:u w:val="dotted"/>
+          <w:u w:val="none"/>
+        </w:rPr>
+        <w:tab/>
+      </w:r>
+      <w:r>
+        <w:rPr>
+          <w:rFonts w:ascii="TH Sarabun New" w:hAnsi="TH Sarabun New" w:cs="TH Sarabun New"/>
+          <w:sz w:val="30"/>
+          <w:u w:val="none"/>
         </w:rPr>
         <w:t>{{p_license_book}}</w:t>
       </w:r>
@@ -371,31 +371,31 @@
         <w:rPr>
           <w:rFonts w:ascii="TH Sarabun New" w:hAnsi="TH Sarabun New" w:cs="TH Sarabun New"/>
           <w:sz w:val="30"/>
-          <w:u w:val="dotted"/>
-        </w:rPr>
-        <w:tab/>
-      </w:r>
-      <w:r>
-        <w:rPr>
-          <w:rFonts w:ascii="TH Sarabun New" w:hAnsi="TH Sarabun New" w:cs="TH Sarabun New"/>
-          <w:sz w:val="30"/>
           <w:u w:val="none"/>
         </w:rPr>
+        <w:tab/>
+      </w:r>
+      <w:r>
+        <w:rPr>
+          <w:rFonts w:ascii="TH Sarabun New" w:hAnsi="TH Sarabun New" w:cs="TH Sarabun New"/>
+          <w:sz w:val="30"/>
+          <w:u w:val="none"/>
+        </w:rPr>
         <w:t>เลขที่</w:t>
       </w:r>
       <w:r>
         <w:rPr>
           <w:rFonts w:ascii="TH Sarabun New" w:hAnsi="TH Sarabun New" w:cs="TH Sarabun New"/>
           <w:sz w:val="30"/>
-          <w:u w:val="dotted"/>
-        </w:rPr>
-        <w:tab/>
-      </w:r>
-      <w:r>
-        <w:rPr>
-          <w:rFonts w:ascii="TH Sarabun New" w:hAnsi="TH Sarabun New" w:cs="TH Sarabun New"/>
-          <w:sz w:val="30"/>
-          <w:u w:val="dotted"/>
+          <w:u w:val="none"/>
+        </w:rPr>
+        <w:tab/>
+      </w:r>
+      <w:r>
+        <w:rPr>
+          <w:rFonts w:ascii="TH Sarabun New" w:hAnsi="TH Sarabun New" w:cs="TH Sarabun New"/>
+          <w:sz w:val="30"/>
+          <w:u w:val="none"/>
         </w:rPr>
         <w:t>{{p_license_no}}</w:t>
       </w:r>
@@ -403,31 +403,31 @@
         <w:rPr>
           <w:rFonts w:ascii="TH Sarabun New" w:hAnsi="TH Sarabun New" w:cs="TH Sarabun New"/>
           <w:sz w:val="30"/>
-          <w:u w:val="dotted"/>
-        </w:rPr>
-        <w:tab/>
-      </w:r>
-      <w:r>
-        <w:rPr>
-          <w:rFonts w:ascii="TH Sarabun New" w:hAnsi="TH Sarabun New" w:cs="TH Sarabun New"/>
-          <w:sz w:val="30"/>
           <w:u w:val="none"/>
         </w:rPr>
+        <w:tab/>
+      </w:r>
+      <w:r>
+        <w:rPr>
+          <w:rFonts w:ascii="TH Sarabun New" w:hAnsi="TH Sarabun New" w:cs="TH Sarabun New"/>
+          <w:sz w:val="30"/>
+          <w:u w:val="none"/>
+        </w:rPr>
         <w:t>ปี</w:t>
       </w:r>
       <w:r>
         <w:rPr>
           <w:rFonts w:ascii="TH Sarabun New" w:hAnsi="TH Sarabun New" w:cs="TH Sarabun New"/>
           <w:sz w:val="30"/>
-          <w:u w:val="dotted"/>
-        </w:rPr>
-        <w:tab/>
-      </w:r>
-      <w:r>
-        <w:rPr>
-          <w:rFonts w:ascii="TH Sarabun New" w:hAnsi="TH Sarabun New" w:cs="TH Sarabun New"/>
-          <w:sz w:val="30"/>
-          <w:u w:val="dotted"/>
+          <w:u w:val="none"/>
+        </w:rPr>
+        <w:tab/>
+      </w:r>
+      <w:r>
+        <w:rPr>
+          <w:rFonts w:ascii="TH Sarabun New" w:hAnsi="TH Sarabun New" w:cs="TH Sarabun New"/>
+          <w:sz w:val="30"/>
+          <w:u w:val="none"/>
         </w:rPr>
         <w:t>{{p_license_year}}</w:t>
       </w:r>
@@ -435,7 +435,7 @@
         <w:rPr>
           <w:rFonts w:ascii="TH Sarabun New" w:hAnsi="TH Sarabun New" w:cs="TH Sarabun New"/>
           <w:sz w:val="30"/>
-          <w:u w:val="dotted"/>
+          <w:u w:val="none"/>
         </w:rPr>
         <w:tab/>
       </w:r>

</xml_diff>

<commit_message>
fix: revert docx templates paragraph 7 to compact left-aligned 3-tab layout
</commit_message>
<xml_diff>
--- a/template 1.docx
+++ b/template 1.docx
@@ -325,12 +325,9 @@
     <w:p>
       <w:pPr>
         <w:tabs>
-          <w:tab w:pos="1701" w:val="center" w:leader="dot"/>
-          <w:tab w:pos="2324" w:val="left" w:leader="dot"/>
-          <w:tab w:pos="3628" w:val="center" w:leader="dot"/>
-          <w:tab w:pos="4252" w:val="left" w:leader="dot"/>
-          <w:tab w:pos="5102" w:val="center" w:leader="dot"/>
-          <w:tab w:pos="5726" w:val="left" w:leader="dot"/>
+          <w:tab w:pos="1814" w:val="left"/>
+          <w:tab w:pos="3685" w:val="left"/>
+          <w:tab w:pos="4989" w:val="left"/>
         </w:tabs>
         <w:spacing w:before="120"/>
         <w:ind w:left="0"/>
@@ -355,9 +352,41 @@
         <w:rPr>
           <w:rFonts w:ascii="TH Sarabun New" w:hAnsi="TH Sarabun New" w:cs="TH Sarabun New"/>
           <w:sz w:val="30"/>
+          <w:u w:val="dotted"/>
+        </w:rPr>
+        <w:tab/>
+      </w:r>
+      <w:r>
+        <w:rPr>
+          <w:rFonts w:ascii="TH Sarabun New" w:hAnsi="TH Sarabun New" w:cs="TH Sarabun New"/>
+          <w:sz w:val="30"/>
+          <w:u w:val="dotted"/>
+        </w:rPr>
+        <w:t>{{p_license_book}}</w:t>
+      </w:r>
+      <w:r>
+        <w:rPr>
+          <w:rFonts w:ascii="TH Sarabun New" w:hAnsi="TH Sarabun New" w:cs="TH Sarabun New"/>
+          <w:sz w:val="30"/>
           <w:u w:val="none"/>
         </w:rPr>
-        <w:tab/>
+        <w:t xml:space="preserve">   เลขที่</w:t>
+      </w:r>
+      <w:r>
+        <w:rPr>
+          <w:rFonts w:ascii="TH Sarabun New" w:hAnsi="TH Sarabun New" w:cs="TH Sarabun New"/>
+          <w:sz w:val="30"/>
+          <w:u w:val="dotted"/>
+        </w:rPr>
+        <w:tab/>
+      </w:r>
+      <w:r>
+        <w:rPr>
+          <w:rFonts w:ascii="TH Sarabun New" w:hAnsi="TH Sarabun New" w:cs="TH Sarabun New"/>
+          <w:sz w:val="30"/>
+          <w:u w:val="dotted"/>
+        </w:rPr>
+        <w:t>{{p_license_no}}</w:t>
       </w:r>
       <w:r>
         <w:rPr>
@@ -365,79 +394,23 @@
           <w:sz w:val="30"/>
           <w:u w:val="none"/>
         </w:rPr>
-        <w:t>{{p_license_book}}</w:t>
-      </w:r>
-      <w:r>
-        <w:rPr>
-          <w:rFonts w:ascii="TH Sarabun New" w:hAnsi="TH Sarabun New" w:cs="TH Sarabun New"/>
-          <w:sz w:val="30"/>
-          <w:u w:val="none"/>
-        </w:rPr>
-        <w:tab/>
-      </w:r>
-      <w:r>
-        <w:rPr>
-          <w:rFonts w:ascii="TH Sarabun New" w:hAnsi="TH Sarabun New" w:cs="TH Sarabun New"/>
-          <w:sz w:val="30"/>
-          <w:u w:val="none"/>
-        </w:rPr>
-        <w:t>เลขที่</w:t>
-      </w:r>
-      <w:r>
-        <w:rPr>
-          <w:rFonts w:ascii="TH Sarabun New" w:hAnsi="TH Sarabun New" w:cs="TH Sarabun New"/>
-          <w:sz w:val="30"/>
-          <w:u w:val="none"/>
-        </w:rPr>
-        <w:tab/>
-      </w:r>
-      <w:r>
-        <w:rPr>
-          <w:rFonts w:ascii="TH Sarabun New" w:hAnsi="TH Sarabun New" w:cs="TH Sarabun New"/>
-          <w:sz w:val="30"/>
-          <w:u w:val="none"/>
-        </w:rPr>
-        <w:t>{{p_license_no}}</w:t>
-      </w:r>
-      <w:r>
-        <w:rPr>
-          <w:rFonts w:ascii="TH Sarabun New" w:hAnsi="TH Sarabun New" w:cs="TH Sarabun New"/>
-          <w:sz w:val="30"/>
-          <w:u w:val="none"/>
-        </w:rPr>
-        <w:tab/>
-      </w:r>
-      <w:r>
-        <w:rPr>
-          <w:rFonts w:ascii="TH Sarabun New" w:hAnsi="TH Sarabun New" w:cs="TH Sarabun New"/>
-          <w:sz w:val="30"/>
-          <w:u w:val="none"/>
-        </w:rPr>
-        <w:t>ปี</w:t>
-      </w:r>
-      <w:r>
-        <w:rPr>
-          <w:rFonts w:ascii="TH Sarabun New" w:hAnsi="TH Sarabun New" w:cs="TH Sarabun New"/>
-          <w:sz w:val="30"/>
-          <w:u w:val="none"/>
-        </w:rPr>
-        <w:tab/>
-      </w:r>
-      <w:r>
-        <w:rPr>
-          <w:rFonts w:ascii="TH Sarabun New" w:hAnsi="TH Sarabun New" w:cs="TH Sarabun New"/>
-          <w:sz w:val="30"/>
-          <w:u w:val="none"/>
+        <w:t xml:space="preserve">   ปี</w:t>
+      </w:r>
+      <w:r>
+        <w:rPr>
+          <w:rFonts w:ascii="TH Sarabun New" w:hAnsi="TH Sarabun New" w:cs="TH Sarabun New"/>
+          <w:sz w:val="30"/>
+          <w:u w:val="dotted"/>
+        </w:rPr>
+        <w:tab/>
+      </w:r>
+      <w:r>
+        <w:rPr>
+          <w:rFonts w:ascii="TH Sarabun New" w:hAnsi="TH Sarabun New" w:cs="TH Sarabun New"/>
+          <w:sz w:val="30"/>
+          <w:u w:val="dotted"/>
         </w:rPr>
         <w:t>{{p_license_year}}</w:t>
-      </w:r>
-      <w:r>
-        <w:rPr>
-          <w:rFonts w:ascii="TH Sarabun New" w:hAnsi="TH Sarabun New" w:cs="TH Sarabun New"/>
-          <w:sz w:val="30"/>
-          <w:u w:val="none"/>
-        </w:rPr>
-        <w:tab/>
       </w:r>
       <w:r>
         <w:rPr>

</xml_diff>

<commit_message>
fix: revert docx templates paragraph 7 to centered tab leader layout
</commit_message>
<xml_diff>
--- a/template 1.docx
+++ b/template 1.docx
@@ -325,9 +325,12 @@
     <w:p>
       <w:pPr>
         <w:tabs>
-          <w:tab w:pos="1814" w:val="left"/>
-          <w:tab w:pos="3685" w:val="left"/>
-          <w:tab w:pos="4989" w:val="left"/>
+          <w:tab w:pos="1701" w:val="center" w:leader="dot"/>
+          <w:tab w:pos="2324" w:val="left" w:leader="dot"/>
+          <w:tab w:pos="3628" w:val="center" w:leader="dot"/>
+          <w:tab w:pos="4252" w:val="left" w:leader="dot"/>
+          <w:tab w:pos="5102" w:val="center" w:leader="dot"/>
+          <w:tab w:pos="5726" w:val="left" w:leader="dot"/>
         </w:tabs>
         <w:spacing w:before="120"/>
         <w:ind w:left="0"/>
@@ -352,15 +355,15 @@
         <w:rPr>
           <w:rFonts w:ascii="TH Sarabun New" w:hAnsi="TH Sarabun New" w:cs="TH Sarabun New"/>
           <w:sz w:val="30"/>
-          <w:u w:val="dotted"/>
-        </w:rPr>
-        <w:tab/>
-      </w:r>
-      <w:r>
-        <w:rPr>
-          <w:rFonts w:ascii="TH Sarabun New" w:hAnsi="TH Sarabun New" w:cs="TH Sarabun New"/>
-          <w:sz w:val="30"/>
-          <w:u w:val="dotted"/>
+          <w:u w:val="none"/>
+        </w:rPr>
+        <w:tab/>
+      </w:r>
+      <w:r>
+        <w:rPr>
+          <w:rFonts w:ascii="TH Sarabun New" w:hAnsi="TH Sarabun New" w:cs="TH Sarabun New"/>
+          <w:sz w:val="30"/>
+          <w:u w:val="none"/>
         </w:rPr>
         <w:t>{{p_license_book}}</w:t>
       </w:r>
@@ -370,21 +373,29 @@
           <w:sz w:val="30"/>
           <w:u w:val="none"/>
         </w:rPr>
-        <w:t xml:space="preserve">   เลขที่</w:t>
-      </w:r>
-      <w:r>
-        <w:rPr>
-          <w:rFonts w:ascii="TH Sarabun New" w:hAnsi="TH Sarabun New" w:cs="TH Sarabun New"/>
-          <w:sz w:val="30"/>
-          <w:u w:val="dotted"/>
-        </w:rPr>
-        <w:tab/>
-      </w:r>
-      <w:r>
-        <w:rPr>
-          <w:rFonts w:ascii="TH Sarabun New" w:hAnsi="TH Sarabun New" w:cs="TH Sarabun New"/>
-          <w:sz w:val="30"/>
-          <w:u w:val="dotted"/>
+        <w:tab/>
+      </w:r>
+      <w:r>
+        <w:rPr>
+          <w:rFonts w:ascii="TH Sarabun New" w:hAnsi="TH Sarabun New" w:cs="TH Sarabun New"/>
+          <w:sz w:val="30"/>
+          <w:u w:val="none"/>
+        </w:rPr>
+        <w:t>เลขที่</w:t>
+      </w:r>
+      <w:r>
+        <w:rPr>
+          <w:rFonts w:ascii="TH Sarabun New" w:hAnsi="TH Sarabun New" w:cs="TH Sarabun New"/>
+          <w:sz w:val="30"/>
+          <w:u w:val="none"/>
+        </w:rPr>
+        <w:tab/>
+      </w:r>
+      <w:r>
+        <w:rPr>
+          <w:rFonts w:ascii="TH Sarabun New" w:hAnsi="TH Sarabun New" w:cs="TH Sarabun New"/>
+          <w:sz w:val="30"/>
+          <w:u w:val="none"/>
         </w:rPr>
         <w:t>{{p_license_no}}</w:t>
       </w:r>
@@ -394,23 +405,39 @@
           <w:sz w:val="30"/>
           <w:u w:val="none"/>
         </w:rPr>
-        <w:t xml:space="preserve">   ปี</w:t>
-      </w:r>
-      <w:r>
-        <w:rPr>
-          <w:rFonts w:ascii="TH Sarabun New" w:hAnsi="TH Sarabun New" w:cs="TH Sarabun New"/>
-          <w:sz w:val="30"/>
-          <w:u w:val="dotted"/>
-        </w:rPr>
-        <w:tab/>
-      </w:r>
-      <w:r>
-        <w:rPr>
-          <w:rFonts w:ascii="TH Sarabun New" w:hAnsi="TH Sarabun New" w:cs="TH Sarabun New"/>
-          <w:sz w:val="30"/>
-          <w:u w:val="dotted"/>
+        <w:tab/>
+      </w:r>
+      <w:r>
+        <w:rPr>
+          <w:rFonts w:ascii="TH Sarabun New" w:hAnsi="TH Sarabun New" w:cs="TH Sarabun New"/>
+          <w:sz w:val="30"/>
+          <w:u w:val="none"/>
+        </w:rPr>
+        <w:t>ปี</w:t>
+      </w:r>
+      <w:r>
+        <w:rPr>
+          <w:rFonts w:ascii="TH Sarabun New" w:hAnsi="TH Sarabun New" w:cs="TH Sarabun New"/>
+          <w:sz w:val="30"/>
+          <w:u w:val="none"/>
+        </w:rPr>
+        <w:tab/>
+      </w:r>
+      <w:r>
+        <w:rPr>
+          <w:rFonts w:ascii="TH Sarabun New" w:hAnsi="TH Sarabun New" w:cs="TH Sarabun New"/>
+          <w:sz w:val="30"/>
+          <w:u w:val="none"/>
         </w:rPr>
         <w:t>{{p_license_year}}</w:t>
+      </w:r>
+      <w:r>
+        <w:rPr>
+          <w:rFonts w:ascii="TH Sarabun New" w:hAnsi="TH Sarabun New" w:cs="TH Sarabun New"/>
+          <w:sz w:val="30"/>
+          <w:u w:val="none"/>
+        </w:rPr>
+        <w:tab/>
       </w:r>
       <w:r>
         <w:rPr>

</xml_diff>

<commit_message>
chore: restore templates 1, 2, 3 back to their original c4a9cff formatting
</commit_message>
<xml_diff>
--- a/template 1.docx
+++ b/template 1.docx
@@ -325,45 +325,48 @@
     <w:p>
       <w:pPr>
         <w:tabs>
-          <w:tab w:pos="1701" w:val="center" w:leader="dot"/>
-          <w:tab w:pos="2324" w:val="left" w:leader="dot"/>
-          <w:tab w:pos="3628" w:val="center" w:leader="dot"/>
-          <w:tab w:pos="4252" w:val="left" w:leader="dot"/>
-          <w:tab w:pos="5102" w:val="center" w:leader="dot"/>
-          <w:tab w:pos="5726" w:val="left" w:leader="dot"/>
+          <w:tab w:val="center" w:pos="720"/>
+          <w:tab w:val="left" w:pos="1200"/>
+          <w:tab w:val="center" w:pos="1985"/>
+          <w:tab w:val="left" w:pos="2552"/>
+          <w:tab w:val="center" w:pos="3261"/>
+          <w:tab w:val="left" w:pos="3828"/>
         </w:tabs>
         <w:spacing w:before="120"/>
-        <w:ind w:left="0"/>
-        <w:jc w:val="left"/>
-        <w:rPr>
-          <w:rFonts w:ascii="TH Sarabun New" w:hAnsi="TH Sarabun New" w:cs="TH Sarabun New"/>
-          <w:sz w:val="30"/>
-          <w:szCs w:val="30"/>
-          <w:u w:val="dotted"/>
-        </w:rPr>
-      </w:pPr>
-      <w:r/>
-      <w:r>
-        <w:rPr>
-          <w:rFonts w:ascii="TH Sarabun New" w:hAnsi="TH Sarabun New" w:cs="TH Sarabun New"/>
-          <w:sz w:val="30"/>
-          <w:u w:val="none"/>
-        </w:rPr>
-        <w:t xml:space="preserve">     เล่มที่</w:t>
-      </w:r>
-      <w:r>
-        <w:rPr>
-          <w:rFonts w:ascii="TH Sarabun New" w:hAnsi="TH Sarabun New" w:cs="TH Sarabun New"/>
-          <w:sz w:val="30"/>
-          <w:u w:val="none"/>
-        </w:rPr>
-        <w:tab/>
-      </w:r>
-      <w:r>
-        <w:rPr>
-          <w:rFonts w:ascii="TH Sarabun New" w:hAnsi="TH Sarabun New" w:cs="TH Sarabun New"/>
-          <w:sz w:val="30"/>
-          <w:u w:val="none"/>
+        <w:jc w:val="thaiDistribute"/>
+        <w:rPr>
+          <w:rFonts w:ascii="TH Sarabun New" w:hAnsi="TH Sarabun New" w:cs="TH Sarabun New"/>
+          <w:sz w:val="30"/>
+          <w:szCs w:val="30"/>
+          <w:u w:val="dotted"/>
+        </w:rPr>
+      </w:pPr>
+      <w:r>
+        <w:rPr>
+          <w:rFonts w:ascii="TH Sarabun New" w:hAnsi="TH Sarabun New" w:cs="TH Sarabun New"/>
+          <w:sz w:val="30"/>
+          <w:szCs w:val="30"/>
+          <w:cs/>
+          <w:lang w:val="th-TH"/>
+        </w:rPr>
+        <w:t>เล่มที่</w:t>
+      </w:r>
+      <w:r>
+        <w:rPr>
+          <w:rFonts w:ascii="TH Sarabun New" w:hAnsi="TH Sarabun New" w:cs="TH Sarabun New"/>
+          <w:sz w:val="30"/>
+          <w:szCs w:val="30"/>
+          <w:u w:val="dotted"/>
+          <w:cs/>
+        </w:rPr>
+        <w:tab/>
+      </w:r>
+      <w:r>
+        <w:rPr>
+          <w:rFonts w:ascii="TH Sarabun New" w:hAnsi="TH Sarabun New" w:cs="TH Sarabun New"/>
+          <w:sz w:val="30"/>
+          <w:szCs w:val="30"/>
+          <w:u w:val="dotted"/>
         </w:rPr>
         <w:t>{{p_license_book}}</w:t>
       </w:r>
@@ -371,15 +374,18 @@
         <w:rPr>
           <w:rFonts w:ascii="TH Sarabun New" w:hAnsi="TH Sarabun New" w:cs="TH Sarabun New"/>
           <w:sz w:val="30"/>
-          <w:u w:val="none"/>
-        </w:rPr>
-        <w:tab/>
-      </w:r>
-      <w:r>
-        <w:rPr>
-          <w:rFonts w:ascii="TH Sarabun New" w:hAnsi="TH Sarabun New" w:cs="TH Sarabun New"/>
-          <w:sz w:val="30"/>
-          <w:u w:val="none"/>
+          <w:szCs w:val="30"/>
+          <w:u w:val="dotted"/>
+        </w:rPr>
+        <w:t xml:space="preserve">   </w:t>
+      </w:r>
+      <w:r>
+        <w:rPr>
+          <w:rFonts w:ascii="TH Sarabun New" w:hAnsi="TH Sarabun New" w:cs="TH Sarabun New"/>
+          <w:sz w:val="30"/>
+          <w:szCs w:val="30"/>
+          <w:cs/>
+          <w:lang w:val="th-TH"/>
         </w:rPr>
         <w:t>เลขที่</w:t>
       </w:r>
@@ -387,15 +393,26 @@
         <w:rPr>
           <w:rFonts w:ascii="TH Sarabun New" w:hAnsi="TH Sarabun New" w:cs="TH Sarabun New"/>
           <w:sz w:val="30"/>
-          <w:u w:val="none"/>
-        </w:rPr>
-        <w:tab/>
-      </w:r>
-      <w:r>
-        <w:rPr>
-          <w:rFonts w:ascii="TH Sarabun New" w:hAnsi="TH Sarabun New" w:cs="TH Sarabun New"/>
-          <w:sz w:val="30"/>
-          <w:u w:val="none"/>
+          <w:szCs w:val="30"/>
+        </w:rPr>
+        <w:t xml:space="preserve">  </w:t>
+      </w:r>
+      <w:r>
+        <w:rPr>
+          <w:rFonts w:ascii="TH Sarabun New" w:hAnsi="TH Sarabun New" w:cs="TH Sarabun New"/>
+          <w:sz w:val="30"/>
+          <w:szCs w:val="30"/>
+          <w:u w:val="dotted"/>
+          <w:cs/>
+        </w:rPr>
+        <w:tab/>
+      </w:r>
+      <w:r>
+        <w:rPr>
+          <w:rFonts w:ascii="TH Sarabun New" w:hAnsi="TH Sarabun New" w:cs="TH Sarabun New"/>
+          <w:sz w:val="30"/>
+          <w:szCs w:val="30"/>
+          <w:u w:val="dotted"/>
         </w:rPr>
         <w:t>{{p_license_no}}</w:t>
       </w:r>
@@ -403,15 +420,18 @@
         <w:rPr>
           <w:rFonts w:ascii="TH Sarabun New" w:hAnsi="TH Sarabun New" w:cs="TH Sarabun New"/>
           <w:sz w:val="30"/>
-          <w:u w:val="none"/>
-        </w:rPr>
-        <w:tab/>
-      </w:r>
-      <w:r>
-        <w:rPr>
-          <w:rFonts w:ascii="TH Sarabun New" w:hAnsi="TH Sarabun New" w:cs="TH Sarabun New"/>
-          <w:sz w:val="30"/>
-          <w:u w:val="none"/>
+          <w:szCs w:val="30"/>
+          <w:u w:val="dotted"/>
+        </w:rPr>
+        <w:t xml:space="preserve"> </w:t>
+      </w:r>
+      <w:r>
+        <w:rPr>
+          <w:rFonts w:ascii="TH Sarabun New" w:hAnsi="TH Sarabun New" w:cs="TH Sarabun New"/>
+          <w:sz w:val="30"/>
+          <w:szCs w:val="30"/>
+          <w:cs/>
+          <w:lang w:val="th-TH"/>
         </w:rPr>
         <w:t>ปี</w:t>
       </w:r>
@@ -419,31 +439,27 @@
         <w:rPr>
           <w:rFonts w:ascii="TH Sarabun New" w:hAnsi="TH Sarabun New" w:cs="TH Sarabun New"/>
           <w:sz w:val="30"/>
-          <w:u w:val="none"/>
-        </w:rPr>
-        <w:tab/>
-      </w:r>
-      <w:r>
-        <w:rPr>
-          <w:rFonts w:ascii="TH Sarabun New" w:hAnsi="TH Sarabun New" w:cs="TH Sarabun New"/>
-          <w:sz w:val="30"/>
-          <w:u w:val="none"/>
+          <w:szCs w:val="30"/>
+          <w:u w:val="dotted"/>
+        </w:rPr>
+        <w:t xml:space="preserve">   </w:t>
+      </w:r>
+      <w:r>
+        <w:rPr>
+          <w:rFonts w:ascii="TH Sarabun New" w:hAnsi="TH Sarabun New" w:cs="TH Sarabun New"/>
+          <w:sz w:val="30"/>
+          <w:szCs w:val="30"/>
+          <w:u w:val="dotted"/>
         </w:rPr>
         <w:t>{{p_license_year}}</w:t>
       </w:r>
       <w:r>
         <w:rPr>
-          <w:rFonts w:ascii="TH Sarabun New" w:hAnsi="TH Sarabun New" w:cs="TH Sarabun New"/>
-          <w:sz w:val="30"/>
-          <w:u w:val="none"/>
-        </w:rPr>
-        <w:tab/>
-      </w:r>
-      <w:r>
-        <w:rPr>
-          <w:rFonts w:ascii="TH Sarabun New" w:hAnsi="TH Sarabun New" w:cs="TH Sarabun New"/>
-          <w:sz w:val="30"/>
-          <w:u w:val="none"/>
+          <w:rFonts w:ascii="TH Sarabun New" w:hAnsi="TH Sarabun New" w:cs="TH Sarabun New" w:hint="cs"/>
+          <w:sz w:val="30"/>
+          <w:szCs w:val="30"/>
+          <w:u w:val="dotted"/>
+          <w:cs/>
         </w:rPr>
         <w:t xml:space="preserve"> </w:t>
       </w:r>
@@ -541,7 +557,7 @@
           <w:rFonts w:ascii="TH Sarabun New" w:hAnsi="TH Sarabun New" w:cs="TH Sarabun New"/>
           <w:sz w:val="30"/>
           <w:szCs w:val="30"/>
-          <w:u w:val="none"/>
+          <w:u w:val="dotted"/>
         </w:rPr>
         <w:t>{{p_nationality}}</w:t>
       </w:r>

</xml_diff>